<commit_message>
Docs: evaluation design section, oracle upper-bound claim corrected, RL train-test leakage disclosed
</commit_message>
<xml_diff>
--- a/docs/AquaReserve-Design-and-Testing-Document.docx
+++ b/docs/AquaReserve-Design-and-Testing-Document.docx
@@ -11912,9 +11912,6 @@
         <w:t>7. Results</w:t>
       </w:r>
       <w:bookmarkEnd w:id="30"/>
-      <w:r>
-        <w:t xml:space="preserve"> </w:t>
-      </w:r>
     </w:p>
     <w:p>
       <w:pPr>
@@ -13614,10 +13611,7 @@
         <w:spacing w:after="120" w:line="276" w:lineRule="auto"/>
       </w:pPr>
       <w:r>
-        <w:t>P</w:t>
-      </w:r>
-      <w:r>
-        <w:t>roduction is not strictly lower under severe than under moderate for every controller, because moderate is a synthetic 30% rainfall cut with elevated demand while severe is the real 2019 year (dry but cool, so low ET0 demand);</w:t>
+        <w:t>Production is not strictly lower under severe than under moderate for every controller, because moderate is a synthetic 30% rainfall cut with elevated demand while severe is the real 2019 year (dry but cool, so low ET0 demand);</w:t>
       </w:r>
     </w:p>
     <w:p>
@@ -13630,10 +13624,7 @@
         <w:spacing w:after="120" w:line="276" w:lineRule="auto"/>
       </w:pPr>
       <w:r>
-        <w:t>R</w:t>
-      </w:r>
-      <w:r>
-        <w:t>obust MPC wins the genuinely uncertain moderate case while tying point MPC under the cool-dry real 2019.</w:t>
+        <w:t>Robust MPC wins the genuinely uncertain moderate case while tying point MPC under the cool-dry real 2019.</w:t>
       </w:r>
     </w:p>
     <w:p>
@@ -15749,10 +15740,7 @@
         <w:spacing w:after="120" w:line="276" w:lineRule="auto"/>
       </w:pPr>
       <w:r>
-        <w:t xml:space="preserve">a </w:t>
-      </w:r>
-      <w:r>
-        <w:t xml:space="preserve">broad base of fast unit tests (pure functions - unit conversions, ET, soil-water balance, yield, reserve), </w:t>
+        <w:t xml:space="preserve">a broad base of fast unit tests (pure functions - unit conversions, ET, soil-water balance, yield, reserve), </w:t>
       </w:r>
     </w:p>
     <w:p>
@@ -15987,10 +15975,7 @@
               <w:spacing w:line="250" w:lineRule="auto"/>
             </w:pPr>
             <w:r>
-              <w:t>U</w:t>
-            </w:r>
-            <w:r>
-              <w:t>nit conversions, FAO-56 ET vs worked example, soil-water bounds, Ky yield, reserve non-negativity</w:t>
+              <w:t>Unit conversions, FAO-56 ET vs worked example, soil-water bounds, Ky yield, reserve non-negativity</w:t>
             </w:r>
             <w:r>
               <w:t>.</w:t>
@@ -16055,10 +16040,7 @@
               <w:spacing w:line="250" w:lineRule="auto"/>
             </w:pPr>
             <w:r>
-              <w:t>E</w:t>
-            </w:r>
-            <w:r>
-              <w:t>xample scenario loads and validates; invalid configs rejected; one engine step</w:t>
+              <w:t>Example scenario loads and validates; invalid configs rejected; one engine step</w:t>
             </w:r>
             <w:r>
               <w:t>.</w:t>
@@ -16129,10 +16111,7 @@
               <w:spacing w:line="250" w:lineRule="auto"/>
             </w:pPr>
             <w:r>
-              <w:t>O</w:t>
-            </w:r>
-            <w:r>
-              <w:t>ur engine vs pyfao56 (ET, soil-water balance) and AquaCrop-OSPy (biomass/yield) within documented tolerances</w:t>
+              <w:t>Our engine vs pyfao56 (ET, soil-water balance) and AquaCrop-OSPy (biomass/yield) within documented tolerances</w:t>
             </w:r>
             <w:r>
               <w:t>.</w:t>
@@ -16203,10 +16182,7 @@
               <w:spacing w:line="250" w:lineRule="auto"/>
             </w:pPr>
             <w:r>
-              <w:t>S</w:t>
-            </w:r>
-            <w:r>
-              <w:t>oil water stays within wilting-point and field-capacity bounds; reserve never negative; more water gives at least as much yield (monotonicity)</w:t>
+              <w:t>Soil water stays within wilting-point and field-capacity bounds; reserve never negative; more water gives at least as much yield (monotonicity)</w:t>
             </w:r>
             <w:r>
               <w:t>.</w:t>
@@ -16271,10 +16247,7 @@
               <w:spacing w:line="250" w:lineRule="auto"/>
             </w:pPr>
             <w:r>
-              <w:t>G</w:t>
-            </w:r>
-            <w:r>
-              <w:t>olden-run metrics for a fixed scenario do not drift unexpectedly</w:t>
+              <w:t>Golden-run metrics for a fixed scenario do not drift unexpectedly</w:t>
             </w:r>
             <w:r>
               <w:t>.</w:t>
@@ -16351,10 +16324,7 @@
               <w:spacing w:line="250" w:lineRule="auto"/>
             </w:pPr>
             <w:r>
-              <w:t>T</w:t>
-            </w:r>
-            <w:r>
-              <w:t>he API serves the store; configure, proposal, auth and the live demo endpoints behave</w:t>
+              <w:t>The API serves the store; configure, proposal, auth and the live demo endpoints behave</w:t>
             </w:r>
             <w:r>
               <w:t>.</w:t>
@@ -16900,28 +16870,7 @@
           <w:i/>
           <w:iCs/>
         </w:rPr>
-        <w:t>Tests are A</w:t>
-      </w:r>
-      <w:r>
-        <w:rPr>
-          <w:i/>
-          <w:iCs/>
-        </w:rPr>
-        <w:t xml:space="preserve">ll </w:t>
-      </w:r>
-      <w:r>
-        <w:rPr>
-          <w:i/>
-          <w:iCs/>
-        </w:rPr>
-        <w:t>P</w:t>
-      </w:r>
-      <w:r>
-        <w:rPr>
-          <w:i/>
-          <w:iCs/>
-        </w:rPr>
-        <w:t>assing</w:t>
+        <w:t>Tests are All Passing</w:t>
       </w:r>
     </w:p>
     <w:p>
@@ -16942,42 +16891,7 @@
           <w:i/>
           <w:iCs/>
         </w:rPr>
-        <w:t>S</w:t>
-      </w:r>
-      <w:r>
-        <w:rPr>
-          <w:i/>
-          <w:iCs/>
-        </w:rPr>
-        <w:t xml:space="preserve">panning 26 </w:t>
-      </w:r>
-      <w:r>
-        <w:rPr>
-          <w:i/>
-          <w:iCs/>
-        </w:rPr>
-        <w:t>T</w:t>
-      </w:r>
-      <w:r>
-        <w:rPr>
-          <w:i/>
-          <w:iCs/>
-        </w:rPr>
-        <w:t xml:space="preserve">est </w:t>
-      </w:r>
-      <w:r>
-        <w:rPr>
-          <w:i/>
-          <w:iCs/>
-        </w:rPr>
-        <w:t>M</w:t>
-      </w:r>
-      <w:r>
-        <w:rPr>
-          <w:i/>
-          <w:iCs/>
-        </w:rPr>
-        <w:t>odules</w:t>
+        <w:t>Spanning 26 Test Modules</w:t>
       </w:r>
     </w:p>
     <w:p>
@@ -17017,10 +16931,7 @@
         <w:spacing w:after="120" w:line="276" w:lineRule="auto"/>
       </w:pPr>
       <w:r>
-        <w:t>E</w:t>
-      </w:r>
-      <w:r>
-        <w:t>stimators</w:t>
+        <w:t>Estimators</w:t>
       </w:r>
     </w:p>
     <w:p>
@@ -17033,10 +16944,7 @@
         <w:spacing w:after="120" w:line="276" w:lineRule="auto"/>
       </w:pPr>
       <w:r>
-        <w:t>C</w:t>
-      </w:r>
-      <w:r>
-        <w:t>ontrollers</w:t>
+        <w:t>Controllers</w:t>
       </w:r>
     </w:p>
     <w:p>
@@ -17049,10 +16957,7 @@
         <w:spacing w:after="120" w:line="276" w:lineRule="auto"/>
       </w:pPr>
       <w:r>
-        <w:t>M</w:t>
-      </w:r>
-      <w:r>
-        <w:t>etrics</w:t>
+        <w:t>Metrics</w:t>
       </w:r>
     </w:p>
     <w:p>
@@ -17065,10 +16970,7 @@
         <w:spacing w:after="120" w:line="276" w:lineRule="auto"/>
       </w:pPr>
       <w:r>
-        <w:t>E</w:t>
-      </w:r>
-      <w:r>
-        <w:t>conomics</w:t>
+        <w:t>Economics</w:t>
       </w:r>
     </w:p>
     <w:p>
@@ -17094,10 +16996,7 @@
         <w:spacing w:after="120" w:line="276" w:lineRule="auto"/>
       </w:pPr>
       <w:r>
-        <w:t>C</w:t>
-      </w:r>
-      <w:r>
-        <w:t>onfigurator</w:t>
+        <w:t>Configurator</w:t>
       </w:r>
     </w:p>
     <w:p>
@@ -18353,10 +18252,7 @@
         <w:spacing w:after="120" w:line="276" w:lineRule="auto"/>
       </w:pPr>
       <w:r>
-        <w:t>K</w:t>
-      </w:r>
-      <w:r>
-        <w:t>eep the farmer's upfront cost small (buy anything commoditised, build only genuine IP and offer pricing that defers capex)</w:t>
+        <w:t>Keep the farmer's upfront cost small (buy anything commoditised, build only genuine IP and offer pricing that defers capex)</w:t>
       </w:r>
       <w:r>
         <w:t>.</w:t>
@@ -18372,10 +18268,7 @@
         <w:spacing w:after="120" w:line="276" w:lineRule="auto"/>
       </w:pPr>
       <w:r>
-        <w:t>N</w:t>
-      </w:r>
-      <w:r>
-        <w:t>ever let safety-critical control depend on the subscription (the edge node keeps the crop safe when comms, cloud or billing are unavailable)</w:t>
+        <w:t>Never let safety-critical control depend on the subscription (the edge node keeps the crop safe when comms, cloud or billing are unavailable)</w:t>
       </w:r>
       <w:r>
         <w:t>.</w:t>
@@ -18391,10 +18284,7 @@
         <w:spacing w:after="120" w:line="276" w:lineRule="auto"/>
       </w:pPr>
       <w:r>
-        <w:t>R</w:t>
-      </w:r>
-      <w:r>
-        <w:t>euse the ROI model as the sales tool, so the same engine that proved the case quotes and designs each site.</w:t>
+        <w:t>Reuse the ROI model as the sales tool, so the same engine that proved the case quotes and designs each site.</w:t>
       </w:r>
     </w:p>
     <w:p>
@@ -18760,10 +18650,7 @@
               <w:spacing w:line="250" w:lineRule="auto"/>
             </w:pPr>
             <w:r>
-              <w:t>M</w:t>
-            </w:r>
-            <w:r>
-              <w:t>ostly COTS; the node is assembled AquaReserve IP</w:t>
+              <w:t>Mostly COTS; the node is assembled AquaReserve IP</w:t>
             </w:r>
           </w:p>
         </w:tc>
@@ -18937,10 +18824,7 @@
               <w:spacing w:line="250" w:lineRule="auto"/>
             </w:pPr>
             <w:r>
-              <w:t>B</w:t>
-            </w:r>
-            <w:r>
-              <w:t>uy (civil works)</w:t>
+              <w:t>Buy (civil works)</w:t>
             </w:r>
           </w:p>
         </w:tc>
@@ -19021,10 +18905,7 @@
               <w:spacing w:line="250" w:lineRule="auto"/>
             </w:pPr>
             <w:r>
-              <w:t>B</w:t>
-            </w:r>
-            <w:r>
-              <w:t>uy (installer network)</w:t>
+              <w:t>Buy (installer network)</w:t>
             </w:r>
           </w:p>
         </w:tc>
@@ -19372,10 +19253,7 @@
         <w:spacing w:after="120" w:line="276" w:lineRule="auto"/>
       </w:pPr>
       <w:r>
-        <w:t>O</w:t>
-      </w:r>
-      <w:r>
-        <w:t>utright capex; an equipment-as-a-service lease (the configurator already returns an indicative monthly figure that amortises the system)</w:t>
+        <w:t>Outright capex; an equipment-as-a-service lease (the configurator already returns an indicative monthly figure that amortises the system)</w:t>
       </w:r>
       <w:r>
         <w:t xml:space="preserve"> </w:t>
@@ -19471,13 +19349,7 @@
       </w:pPr>
       <w:r>
         <w:lastRenderedPageBreak/>
-        <w:t>M</w:t>
-      </w:r>
-      <w:r>
-        <w:t>ulti-tenant accounts with farms, zones and roles</w:t>
-      </w:r>
-      <w:r>
-        <w:t>.</w:t>
+        <w:t>Multi-tenant accounts with farms, zones and roles.</w:t>
       </w:r>
     </w:p>
     <w:p>
@@ -19490,13 +19362,7 @@
         <w:spacing w:after="120" w:line="276" w:lineRule="auto"/>
       </w:pPr>
       <w:r>
-        <w:t>A</w:t>
-      </w:r>
-      <w:r>
-        <w:t xml:space="preserve"> telemetry ingest pipeline (MQTT or LoRaWAN into a time-series store)</w:t>
-      </w:r>
-      <w:r>
-        <w:t>.</w:t>
+        <w:t>A telemetry ingest pipeline (MQTT or LoRaWAN into a time-series store).</w:t>
       </w:r>
     </w:p>
     <w:p>
@@ -19509,13 +19375,7 @@
         <w:spacing w:after="120" w:line="276" w:lineRule="auto"/>
       </w:pPr>
       <w:r>
-        <w:t>T</w:t>
-      </w:r>
-      <w:r>
-        <w:t>he optimiser running live on real data and issuing valve and pump setpoints with manual override and an audit log</w:t>
-      </w:r>
-      <w:r>
-        <w:t>.</w:t>
+        <w:t>The optimiser running live on real data and issuing valve and pump setpoints with manual override and an audit log.</w:t>
       </w:r>
     </w:p>
     <w:p>
@@ -19528,13 +19388,7 @@
         <w:spacing w:after="120" w:line="276" w:lineRule="auto"/>
       </w:pPr>
       <w:r>
-        <w:t xml:space="preserve">A </w:t>
-      </w:r>
-      <w:r>
-        <w:t>monitoring app with live status, alerts and a phone-friendly paddock view</w:t>
-      </w:r>
-      <w:r>
-        <w:t>.</w:t>
+        <w:t>A monitoring app with live status, alerts and a phone-friendly paddock view.</w:t>
       </w:r>
     </w:p>
     <w:p>
@@ -19547,13 +19401,7 @@
         <w:spacing w:after="120" w:line="276" w:lineRule="auto"/>
       </w:pPr>
       <w:r>
-        <w:t>A</w:t>
-      </w:r>
-      <w:r>
-        <w:t>n edge node that keeps irrigating on a sensible local policy when offline and syncs when reconnected</w:t>
-      </w:r>
-      <w:r>
-        <w:t>.</w:t>
+        <w:t>An edge node that keeps irrigating on a sensible local policy when offline and syncs when reconnected.</w:t>
       </w:r>
     </w:p>
     <w:p>
@@ -19566,10 +19414,7 @@
         <w:spacing w:after="120" w:line="276" w:lineRule="auto"/>
       </w:pPr>
       <w:r>
-        <w:t>O</w:t>
-      </w:r>
-      <w:r>
-        <w:t xml:space="preserve">ver-the-air firmware updates with remote diagnostics. </w:t>
+        <w:t xml:space="preserve">Over-the-air firmware updates with remote diagnostics. </w:t>
       </w:r>
     </w:p>
     <w:p>
@@ -19620,13 +19465,7 @@
         <w:spacing w:after="120" w:line="276" w:lineRule="auto"/>
       </w:pPr>
       <w:r>
-        <w:t xml:space="preserve">A </w:t>
-      </w:r>
-      <w:r>
-        <w:t>site-assessment and design tool that extends the configurator into a full proposal</w:t>
-      </w:r>
-      <w:r>
-        <w:t>.</w:t>
+        <w:t>A site-assessment and design tool that extends the configurator into a full proposal.</w:t>
       </w:r>
     </w:p>
     <w:p>
@@ -19639,13 +19478,7 @@
         <w:spacing w:after="120" w:line="276" w:lineRule="auto"/>
       </w:pPr>
       <w:r>
-        <w:t>A</w:t>
-      </w:r>
-      <w:r>
-        <w:t xml:space="preserve"> certified installer network (partnering with existing irrigation dealers) so installs scale without hiring crews everywhere</w:t>
-      </w:r>
-      <w:r>
-        <w:t>.</w:t>
+        <w:t>A certified installer network (partnering with existing irrigation dealers) so installs scale without hiring crews everywhere.</w:t>
       </w:r>
     </w:p>
     <w:p>
@@ -19658,13 +19491,7 @@
         <w:spacing w:after="120" w:line="276" w:lineRule="auto"/>
       </w:pPr>
       <w:r>
-        <w:t>A</w:t>
-      </w:r>
-      <w:r>
-        <w:t xml:space="preserve"> commissioning checklist and customer handover pack so every install is calibrated and documented</w:t>
-      </w:r>
-      <w:r>
-        <w:t>.</w:t>
+        <w:t>A commissioning checklist and customer handover pack so every install is calibrated and documented.</w:t>
       </w:r>
     </w:p>
     <w:p>
@@ -19677,13 +19504,7 @@
         <w:spacing w:after="120" w:line="276" w:lineRule="auto"/>
       </w:pPr>
       <w:r>
-        <w:t>S</w:t>
-      </w:r>
-      <w:r>
-        <w:t>upport with an SLA, spare-parts logistics and remote monitoring that catches faults before the grower notices</w:t>
-      </w:r>
-      <w:r>
-        <w:t xml:space="preserve">. </w:t>
+        <w:t xml:space="preserve">Support with an SLA, spare-parts logistics and remote monitoring that catches faults before the grower notices. </w:t>
       </w:r>
     </w:p>
     <w:p>
@@ -19696,10 +19517,7 @@
         <w:spacing w:after="120" w:line="276" w:lineRule="auto"/>
       </w:pPr>
       <w:r>
-        <w:t>D</w:t>
-      </w:r>
-      <w:r>
-        <w:t>efined warranty and service-contract terms.</w:t>
+        <w:t>Defined warranty and service-contract terms.</w:t>
       </w:r>
     </w:p>
     <w:p>
@@ -20382,14 +20200,7 @@
           <w:i/>
           <w:iCs/>
         </w:rPr>
-        <w:t>C</w:t>
-      </w:r>
-      <w:r>
-        <w:rPr>
-          <w:i/>
-          <w:iCs/>
-        </w:rPr>
-        <w:t>an software make a finite water reserve protect a drought-stressed harvest and is it worth the money.</w:t>
+        <w:t>Can software make a finite water reserve protect a drought-stressed harvest and is it worth the money.</w:t>
       </w:r>
       <w:r>
         <w:t xml:space="preserve"> </w:t>
@@ -20411,13 +20222,7 @@
         <w:spacing w:after="120" w:line="276" w:lineRule="auto"/>
       </w:pPr>
       <w:r>
-        <w:t>A</w:t>
-      </w:r>
-      <w:r>
-        <w:t xml:space="preserve"> family of controllers from simple baselines to model predictive control, a robust quantile MPC, a perfect-foresight oracle and a learned RL policy is compared on the same engine under real drought weather</w:t>
-      </w:r>
-      <w:r>
-        <w:t>.</w:t>
+        <w:t>A family of controllers from simple baselines to model predictive control, a robust quantile MPC, a perfect-foresight oracle and a learned RL policy is compared on the same engine under real drought weather.</w:t>
       </w:r>
     </w:p>
     <w:p>
@@ -20425,10 +20230,7 @@
         <w:spacing w:after="120" w:line="276" w:lineRule="auto"/>
       </w:pPr>
       <w:r>
-        <w:t>T</w:t>
-      </w:r>
-      <w:r>
-        <w:t xml:space="preserve">he economics show a payback under two years that is robust to the assumptions growers care about. The architecture </w:t>
+        <w:t xml:space="preserve">The economics show a payback under two years that is robust to the assumptions growers care about. The architecture </w:t>
       </w:r>
       <w:r>
         <w:t>–</w:t>

</xml_diff>